<commit_message>
Actualizacion de  los datos de autores en los documentos de explicación oral y proyecto integrador.
</commit_message>
<xml_diff>
--- a/Plan_de_Proyecto_Cambio_Climatico_Argentina_CORREGIDO.docx
+++ b/Plan_de_Proyecto_Cambio_Climatico_Argentina_CORREGIDO.docx
@@ -95,7 +95,7 @@
           <w:i/>
           <w:iCs/>
         </w:rPr>
-        <w:t>Elias Campos, Tiago Maidana</w:t>
+        <w:t>Elias Campos, Tiago Maidana, Rodrigo Bulggiani, Romina Guzman</w:t>
       </w:r>
     </w:p>
     <w:p>
@@ -171,6 +171,31 @@
           <w:iCs/>
         </w:rPr>
         <w:t>11 semanas</w:t>
+      </w:r>
+    </w:p>
+    <w:p>
+      <w:pPr>
+        <w:pStyle w:val="ListParagraph"/>
+        <w:numPr>
+          <w:ilvl w:val="0"/>
+          <w:numId w:val="2"/>
+        </w:numPr>
+        <w:spacing w:after="120"/>
+        <w:ind w:left="720" w:hanging="360"/>
+      </w:pPr>
+      <w:r>
+        <w:rPr>
+          <w:b/>
+          <w:bCs/>
+        </w:rPr>
+        <w:t xml:space="preserve">Roles del equipo: </w:t>
+      </w:r>
+      <w:r>
+        <w:rPr>
+          <w:i/>
+          <w:iCs/>
+        </w:rPr>
+        <w:t>Elias Campos (Coordinación y Modelado), Romina Guzman (Ingeniería y Calidad de Datos), Rodrigo Bulggiani (Análisis Exploratorio y Evaluación), Tiago Maidana (Integración y Despliegue)</w:t>
       </w:r>
     </w:p>
     <w:p>
@@ -551,7 +576,7 @@
                 <w:sz w:val="20"/>
                 <w:szCs w:val="20"/>
               </w:rPr>
-              <w:t>Elias Campos</w:t>
+              <w:t>Elias Campos (Equipo)</w:t>
             </w:r>
           </w:p>
         </w:tc>
@@ -668,7 +693,7 @@
                 <w:sz w:val="20"/>
                 <w:szCs w:val="20"/>
               </w:rPr>
-              <w:t>Elias Campos</w:t>
+              <w:t>Romina Guzman</w:t>
             </w:r>
           </w:p>
         </w:tc>
@@ -785,7 +810,7 @@
                 <w:sz w:val="20"/>
                 <w:szCs w:val="20"/>
               </w:rPr>
-              <w:t>Elias Campos</w:t>
+              <w:t>Rodrigo Bulggiani</w:t>
             </w:r>
           </w:p>
         </w:tc>
@@ -902,7 +927,7 @@
                 <w:sz w:val="20"/>
                 <w:szCs w:val="20"/>
               </w:rPr>
-              <w:t>Elias Campos</w:t>
+              <w:t>Romina Guzman</w:t>
             </w:r>
           </w:p>
         </w:tc>
@@ -1019,7 +1044,7 @@
                 <w:sz w:val="20"/>
                 <w:szCs w:val="20"/>
               </w:rPr>
-              <w:t>Elias Campos</w:t>
+              <w:t>Tiago Maidana</w:t>
             </w:r>
           </w:p>
         </w:tc>
@@ -1253,7 +1278,7 @@
                 <w:sz w:val="20"/>
                 <w:szCs w:val="20"/>
               </w:rPr>
-              <w:t>Elias Campos</w:t>
+              <w:t>Rodrigo Bulggiani</w:t>
             </w:r>
           </w:p>
         </w:tc>
@@ -1370,7 +1395,7 @@
                 <w:sz w:val="20"/>
                 <w:szCs w:val="20"/>
               </w:rPr>
-              <w:t>Elias Campos</w:t>
+              <w:t>Tiago Maidana</w:t>
             </w:r>
           </w:p>
         </w:tc>
@@ -1487,7 +1512,7 @@
                 <w:sz w:val="20"/>
                 <w:szCs w:val="20"/>
               </w:rPr>
-              <w:t>Elias Campos</w:t>
+              <w:t>Todo el equipo</w:t>
             </w:r>
           </w:p>
         </w:tc>

</xml_diff>